<commit_message>
feat(benchmark): enhance auto benchmark runner with vacuum pump tracking and workspace safety bounds
</commit_message>
<xml_diff>
--- a/Journal/KUKA_ROS2_Conference_Paper.docx
+++ b/Journal/KUKA_ROS2_Conference_Paper.docx
@@ -79,7 +79,7 @@
               <w:rPr>
                 <w:sz w:val="19"/>
               </w:rPr>
-              <w:t>Seamless and contactless human-robot interaction (HRI) is essential for flexible manufacturing cells and sterile assistive workstations. However, integrating multimodal perception (speech and computer vision) with proprietary industrial robot controllers often suffers from non-deterministic communication latencies, tedious manual calibration routines, and labor-intensive validation protocols. In this paper, we present an end-to-end, deterministic multimodal framework and an automated benchmarking pipeline for color-coded material handling using Robot Operating System 2 (ROS 2) and a 6-DOF KUKA KR6 R900-2 industrial manipulator. The architecture incorporates an offline, privacy-preserving Automatic Speech Recognition (ASR) engine (Vosk) augmented with phonetic alias compensation, a perspective-corrected 2D planar homography mapping based on a 12-marker ArUco constellation, and MoveIt 2 utilizing the deterministic Pilz Industrial Motion Planner. Execution commands and state telemetry are exchanged with the KUKA KRC4 controller over TCP/IP via the Ethernet KRL Interface (EKI). Furthermore, we propose a fully automated benchmarking architecture that eliminates manual intervention during multi-trial experiments by programmatically synchronizing perception queries, trajectory dispatch, kinematic state logging, and error estimation. The framework is validated through a 50-run experimental benchmark evaluating baseline reliability, physical generalization, illumination stress (80 to 900 lux, dynamic shadows), and visual occlusions (up to 60%). Experimental results demonstrate an average decision latency of 1.09 s, a mean Cartesian position error of 2.36 mm, a placement repeatability standard deviation of σ = 0.20 mm, and an overall task success rate of 94.0%. This study offers an accessible, low-compute solution for reliable, hands-free collaborative manipulation on commercial industrial hardware.</w:t>
+              <w:t>Seamless and contactless human-robot interaction (HRI) is essential for flexible manufacturing cells and sterile assistive workstations. However, integrating multimodal perception (speech and computer vision) with proprietary industrial robot controllers often suffers from non-deterministic communication latencies, tedious manual calibration routines, and labor-intensive validation protocols. In this paper, we present an end-to-end, deterministic multimodal framework and an automated benchmarking pipeline for color-coded material handling using Robot Operating System 2 (ROS 2) and a 6-DOF KUKA KR6 R900-2 industrial manipulator. The architecture incorporates an offline, privacy-preserving Automatic Speech Recognition (ASR) engine (Vosk) augmented with phonetic alias compensation, a perspective-corrected 2D planar homography mapping based on a 12-marker ArUco constellation, and MoveIt 2 utilizing the deterministic Pilz Industrial Motion Planner. Execution commands and state telemetry are exchanged with the KUKA KRC4 controller over TCP/IP via the Ethernet KRL Interface (EKI). Furthermore, we propose a fully automated benchmarking architecture that eliminates manual intervention during multi-trial experiments by programmatically synchronizing perception queries, trajectory dispatch, kinematic state logging, and error estimation. Initial empirical validation on the physical hardware demonstrates an end-to-end decision latency of 1.26 s, a mean Cartesian position error of 3.18 mm (±0.33 mm), a mean joint tracking error of 1.55° (±0.11°), and a 100% pick-and-place success rate across the initial physical baseline trials. This study offers an accessible, low-compute solution for reliable, hands-free collaborative manipulation on commercial industrial hardware.</w:t>
             </w:r>
           </w:p>
           <w:p>
@@ -258,10 +258,10 @@
         <w:rPr>
           <w:b/>
         </w:rPr>
-        <w:t xml:space="preserve">Comprehensive 50-Run Empirical Evaluation: </w:t>
+        <w:t xml:space="preserve">Physical Hardware Validation: </w:t>
       </w:r>
       <w:r>
-        <w:t>Rigorous benchmarking evaluating baseline performance, physical generalization across the workspace, optical stress (80 to 900 lux, dynamic shadows), partial visual occlusions (up to 60%), and placement repeatability.</w:t>
+        <w:t>Rigorous baseline verification on the physical KUKA KR6 R900-2 testbed evaluating latency breakdown, joint tracking errors, Cartesian accuracy, and establishing the protocol for full 50-run multi-condition expansion.</w:t>
       </w:r>
     </w:p>
     <w:p>
@@ -1026,7 +1026,7 @@
     </w:p>
     <w:p>
       <w:r>
-        <w:t>The 50-run benchmark comprises four experimental blocks:</w:t>
+        <w:t>The benchmark protocol comprises four experimental blocks:</w:t>
       </w:r>
     </w:p>
     <w:p>
@@ -1143,7 +1143,7 @@
     </w:p>
     <w:p>
       <w:r>
-        <w:t>Table 2 outlines the latency profile across individual pipeline subsystems measured over 50 trials. Total decision latency averaged 1092 ms (approx. 1.09 s), well within natural human interaction limits (&lt;1.5 s).</w:t>
+        <w:t>Table 2 outlines the latency profile across individual pipeline subsystems measured during the initial physical trials. Total decision latency averaged 1262 ms (approx. 1.26 s), well within natural human interaction limits (&lt;1.5 s).</w:t>
       </w:r>
     </w:p>
     <w:p>
@@ -1272,7 +1272,7 @@
           </w:tcPr>
           <w:p>
             <w:r>
-              <w:t>620 ± 45</w:t>
+              <w:t>685 ± 52</w:t>
             </w:r>
           </w:p>
         </w:tc>
@@ -1325,7 +1325,7 @@
           </w:tcPr>
           <w:p>
             <w:r>
-              <w:t>12 ± 2</w:t>
+              <w:t>14 ± 3</w:t>
             </w:r>
           </w:p>
         </w:tc>
@@ -1375,7 +1375,7 @@
           </w:tcPr>
           <w:p>
             <w:r>
-              <w:t>48 ± 6</w:t>
+              <w:t>52 ± 8</w:t>
             </w:r>
           </w:p>
         </w:tc>
@@ -1428,7 +1428,7 @@
           </w:tcPr>
           <w:p>
             <w:r>
-              <w:t>380 ± 35</w:t>
+              <w:t>475 ± 40</w:t>
             </w:r>
           </w:p>
         </w:tc>
@@ -1478,7 +1478,7 @@
           </w:tcPr>
           <w:p>
             <w:r>
-              <w:t>32 ± 8</w:t>
+              <w:t>36 ± 9</w:t>
             </w:r>
           </w:p>
         </w:tc>
@@ -1540,7 +1540,7 @@
               <w:rPr>
                 <w:b/>
               </w:rPr>
-              <w:t>1092 ± 52</w:t>
+              <w:t>1262 ± 115</w:t>
             </w:r>
           </w:p>
         </w:tc>
@@ -1602,7 +1602,7 @@
               <w:rPr>
                 <w:b/>
               </w:rPr>
-              <w:t>5342 ± 195</w:t>
+              <w:t>76526 ± 3150</w:t>
             </w:r>
           </w:p>
         </w:tc>
@@ -1626,12 +1626,12 @@
           <w:color w:val="2C3E50"/>
           <w:sz w:val="22"/>
         </w:rPr>
-        <w:t>5.2 Benchmark Performance Across Categories</w:t>
+        <w:t>5.2 Empirical Physical Baseline Validation</w:t>
       </w:r>
     </w:p>
     <w:p>
       <w:r>
-        <w:t>Table 3 summarizes the aggregated performance metrics across all 50 benchmarking trials.</w:t>
+        <w:t>Table 3 presents the initial physical baseline benchmark results recorded on the physical KUKA KR6 R900-2 hardware testbed across the first 5 complete trials.</w:t>
       </w:r>
     </w:p>
     <w:p>
@@ -1639,7 +1639,7 @@
         <w:pStyle w:val="Caption"/>
       </w:pPr>
       <w:r>
-        <w:t>Table 3. Quantitative Performance Summary Across 50 Benchmark Runs</w:t>
+        <w:t>Table 3. Empirical Baseline Validation Results on Physical KUKA Robot</w:t>
       </w:r>
     </w:p>
     <w:tbl>
@@ -1672,7 +1672,7 @@
               <w:rPr>
                 <w:b/>
               </w:rPr>
-              <w:t>Test Category</w:t>
+              <w:t>Run / Target</w:t>
             </w:r>
           </w:p>
         </w:tc>
@@ -1692,7 +1692,7 @@
               <w:rPr>
                 <w:b/>
               </w:rPr>
-              <w:t>Trials</w:t>
+              <w:t>Success Status</w:t>
             </w:r>
           </w:p>
         </w:tc>
@@ -1712,7 +1712,7 @@
               <w:rPr>
                 <w:b/>
               </w:rPr>
-              <w:t>Success Rate (%)</w:t>
+              <w:t>Pos Error (mm)</w:t>
             </w:r>
           </w:p>
         </w:tc>
@@ -1732,7 +1732,7 @@
               <w:rPr>
                 <w:b/>
               </w:rPr>
-              <w:t>Mean Pos. Error (mm)</w:t>
+              <w:t>Tracking Error (deg)</w:t>
             </w:r>
           </w:p>
         </w:tc>
@@ -1752,7 +1752,7 @@
               <w:rPr>
                 <w:b/>
               </w:rPr>
-              <w:t>Mean Tracking Error (deg)</w:t>
+              <w:t>Completion Time (s)</w:t>
             </w:r>
           </w:p>
         </w:tc>
@@ -1770,7 +1770,7 @@
           </w:tcPr>
           <w:p>
             <w:r>
-              <w:t>Baseline</w:t>
+              <w:t>Run 1 (Red Cube)</w:t>
             </w:r>
           </w:p>
         </w:tc>
@@ -1786,7 +1786,7 @@
           </w:tcPr>
           <w:p>
             <w:r>
-              <w:t>20</w:t>
+              <w:t>SUCCESS (1st Attempt)</w:t>
             </w:r>
           </w:p>
         </w:tc>
@@ -1802,7 +1802,7 @@
           </w:tcPr>
           <w:p>
             <w:r>
-              <w:t>100.0%</w:t>
+              <w:t>3.20 mm</w:t>
             </w:r>
           </w:p>
         </w:tc>
@@ -1818,7 +1818,7 @@
           </w:tcPr>
           <w:p>
             <w:r>
-              <w:t>2.14 ± 0.32</w:t>
+              <w:t>1.56° (max 2.84°)</w:t>
             </w:r>
           </w:p>
         </w:tc>
@@ -1834,7 +1834,7 @@
           </w:tcPr>
           <w:p>
             <w:r>
-              <w:t>0.42 ± 0.08°</w:t>
+              <w:t>77.93 s</w:t>
             </w:r>
           </w:p>
         </w:tc>
@@ -1853,7 +1853,7 @@
           </w:tcPr>
           <w:p>
             <w:r>
-              <w:t>Generalization</w:t>
+              <w:t>Run 2 (Yellow Cube)</w:t>
             </w:r>
           </w:p>
         </w:tc>
@@ -1870,7 +1870,7 @@
           </w:tcPr>
           <w:p>
             <w:r>
-              <w:t>10</w:t>
+              <w:t>SUCCESS (1st Attempt)</w:t>
             </w:r>
           </w:p>
         </w:tc>
@@ -1887,7 +1887,7 @@
           </w:tcPr>
           <w:p>
             <w:r>
-              <w:t>90.0%</w:t>
+              <w:t>2.90 mm</w:t>
             </w:r>
           </w:p>
         </w:tc>
@@ -1904,7 +1904,7 @@
           </w:tcPr>
           <w:p>
             <w:r>
-              <w:t>2.58 ± 0.45</w:t>
+              <w:t>1.48° (max 2.61°)</w:t>
             </w:r>
           </w:p>
         </w:tc>
@@ -1921,7 +1921,7 @@
           </w:tcPr>
           <w:p>
             <w:r>
-              <w:t>0.46 ± 0.11°</w:t>
+              <w:t>74.50 s</w:t>
             </w:r>
           </w:p>
         </w:tc>
@@ -1939,7 +1939,7 @@
           </w:tcPr>
           <w:p>
             <w:r>
-              <w:t>Vision Robustness</w:t>
+              <w:t>Run 3 (Blue Cube)</w:t>
             </w:r>
           </w:p>
         </w:tc>
@@ -1955,7 +1955,7 @@
           </w:tcPr>
           <w:p>
             <w:r>
-              <w:t>10</w:t>
+              <w:t>SUCCESS (1st Attempt)</w:t>
             </w:r>
           </w:p>
         </w:tc>
@@ -1971,7 +1971,7 @@
           </w:tcPr>
           <w:p>
             <w:r>
-              <w:t>80.0%</w:t>
+              <w:t>3.40 mm</w:t>
             </w:r>
           </w:p>
         </w:tc>
@@ -1987,7 +1987,7 @@
           </w:tcPr>
           <w:p>
             <w:r>
-              <w:t>3.12 ± 0.78</w:t>
+              <w:t>1.62° (max 2.95°)</w:t>
             </w:r>
           </w:p>
         </w:tc>
@@ -2003,7 +2003,7 @@
           </w:tcPr>
           <w:p>
             <w:r>
-              <w:t>0.44 ± 0.09°</w:t>
+              <w:t>76.10 s</w:t>
             </w:r>
           </w:p>
         </w:tc>
@@ -2022,7 +2022,7 @@
           </w:tcPr>
           <w:p>
             <w:r>
-              <w:t>Repeatability</w:t>
+              <w:t>Run 4 (Red Cube)</w:t>
             </w:r>
           </w:p>
         </w:tc>
@@ -2039,7 +2039,7 @@
           </w:tcPr>
           <w:p>
             <w:r>
-              <w:t>10</w:t>
+              <w:t>SUCCESS (1st Attempt)</w:t>
             </w:r>
           </w:p>
         </w:tc>
@@ -2056,7 +2056,7 @@
           </w:tcPr>
           <w:p>
             <w:r>
-              <w:t>100.0%</w:t>
+              <w:t>2.80 mm</w:t>
             </w:r>
           </w:p>
         </w:tc>
@@ -2073,7 +2073,7 @@
           </w:tcPr>
           <w:p>
             <w:r>
-              <w:t>1.82 ± 0.21</w:t>
+              <w:t>1.41° (max 2.50°)</w:t>
             </w:r>
           </w:p>
         </w:tc>
@@ -2090,7 +2090,89 @@
           </w:tcPr>
           <w:p>
             <w:r>
-              <w:t>0.38 ± 0.05°</w:t>
+              <w:t>72.85 s</w:t>
+            </w:r>
+          </w:p>
+        </w:tc>
+      </w:tr>
+      <w:tr>
+        <w:tc>
+          <w:tcPr>
+            <w:tcW w:type="dxa" w:w="1872"/>
+            <w:tcMar>
+              <w:top w:w="40" w:type="dxa"/>
+              <w:bottom w:w="40" w:type="dxa"/>
+              <w:left w:w="80" w:type="dxa"/>
+              <w:right w:w="80" w:type="dxa"/>
+            </w:tcMar>
+          </w:tcPr>
+          <w:p>
+            <w:r>
+              <w:t>Run 5 (Yellow Cube)</w:t>
+            </w:r>
+          </w:p>
+        </w:tc>
+        <w:tc>
+          <w:tcPr>
+            <w:tcW w:type="dxa" w:w="1872"/>
+            <w:tcMar>
+              <w:top w:w="40" w:type="dxa"/>
+              <w:bottom w:w="40" w:type="dxa"/>
+              <w:left w:w="80" w:type="dxa"/>
+              <w:right w:w="80" w:type="dxa"/>
+            </w:tcMar>
+          </w:tcPr>
+          <w:p>
+            <w:r>
+              <w:t>SUCCESS (with Retry)</w:t>
+            </w:r>
+          </w:p>
+        </w:tc>
+        <w:tc>
+          <w:tcPr>
+            <w:tcW w:type="dxa" w:w="1872"/>
+            <w:tcMar>
+              <w:top w:w="40" w:type="dxa"/>
+              <w:bottom w:w="40" w:type="dxa"/>
+              <w:left w:w="80" w:type="dxa"/>
+              <w:right w:w="80" w:type="dxa"/>
+            </w:tcMar>
+          </w:tcPr>
+          <w:p>
+            <w:r>
+              <w:t>3.60 mm</w:t>
+            </w:r>
+          </w:p>
+        </w:tc>
+        <w:tc>
+          <w:tcPr>
+            <w:tcW w:type="dxa" w:w="1872"/>
+            <w:tcMar>
+              <w:top w:w="40" w:type="dxa"/>
+              <w:bottom w:w="40" w:type="dxa"/>
+              <w:left w:w="80" w:type="dxa"/>
+              <w:right w:w="80" w:type="dxa"/>
+            </w:tcMar>
+          </w:tcPr>
+          <w:p>
+            <w:r>
+              <w:t>1.68° (max 3.10°)</w:t>
+            </w:r>
+          </w:p>
+        </w:tc>
+        <w:tc>
+          <w:tcPr>
+            <w:tcW w:type="dxa" w:w="1872"/>
+            <w:tcMar>
+              <w:top w:w="40" w:type="dxa"/>
+              <w:bottom w:w="40" w:type="dxa"/>
+              <w:left w:w="80" w:type="dxa"/>
+              <w:right w:w="80" w:type="dxa"/>
+            </w:tcMar>
+          </w:tcPr>
+          <w:p>
+            <w:r>
+              <w:t>81.20 s</w:t>
             </w:r>
           </w:p>
         </w:tc>
@@ -2112,7 +2194,7 @@
               <w:rPr>
                 <w:b/>
               </w:rPr>
-              <w:t>Overall System</w:t>
+              <w:t>Physical Baseline (Mean)</w:t>
             </w:r>
           </w:p>
         </w:tc>
@@ -2132,7 +2214,7 @@
               <w:rPr>
                 <w:b/>
               </w:rPr>
-              <w:t>50</w:t>
+              <w:t>100.0% (5/5 Successful)</w:t>
             </w:r>
           </w:p>
         </w:tc>
@@ -2152,7 +2234,7 @@
               <w:rPr>
                 <w:b/>
               </w:rPr>
-              <w:t>94.0%</w:t>
+              <w:t>3.18 ± 0.33 mm</w:t>
             </w:r>
           </w:p>
         </w:tc>
@@ -2172,7 +2254,7 @@
               <w:rPr>
                 <w:b/>
               </w:rPr>
-              <w:t>2.36 ± 0.48</w:t>
+              <w:t>1.55 ± 0.11°</w:t>
             </w:r>
           </w:p>
         </w:tc>
@@ -2192,7 +2274,7 @@
               <w:rPr>
                 <w:b/>
               </w:rPr>
-              <w:t>0.43 ± 0.08°</w:t>
+              <w:t>76.52 ± 3.15 s</w:t>
             </w:r>
           </w:p>
         </w:tc>
@@ -2216,12 +2298,12 @@
           <w:color w:val="2C3E50"/>
           <w:sz w:val="22"/>
         </w:rPr>
-        <w:t>5.3 Robustness Boundaries and Failure Modes</w:t>
+        <w:t>5.3 Analysis of Physical Observations and Robustness</w:t>
       </w:r>
     </w:p>
     <w:p>
       <w:r>
-        <w:t>The system demonstrated high optical robustness across 150 to 850 lux. Under severe shadows and low illuminance (80 lux), HSV saturation dropped below detection thresholds, causing false negatives. Under visual occlusions up to 40%, the vacuum gripper successfully picked targets; at 60% occlusion, centroid offset exceeded the suction cup radius (8 mm), resulting in grasp failure. Overall, only 3 failures occurred across 50 runs (94% success rate).</w:t>
+        <w:t>Across the physical validation runs, the planar homography consistently localized target components with an average position error of 3.18 mm, which easily falls within the 8.0 mm vacuum suction cup sealing radius. In Run 5, a slight initial gripper offset triggered the recovery re-grasping mechanism, demonstrating the effectiveness of the closed-loop coordinator logic in recovering from minor positional perturbations.</w:t>
       </w:r>
     </w:p>
     <w:p>
@@ -2241,7 +2323,7 @@
     </w:p>
     <w:p>
       <w:r>
-        <w:t>This study presented an end-to-end deterministic multimodal manipulation framework and an automated benchmarking pipeline for color-coded material handling using ROS 2 and an industrial KUKA KR6 R900-2 manipulator. By coupling offline Vosk speech recognition with a 12-marker ArUco planar homography transformation and MoveIt 2 Pilz industrial motion planning over KUKA Ethernet KRL (EKI), the system achieves hands-free manipulation with an average decision latency of 1.09 s and sub-2.4 mm positioning accuracy. The automated benchmarking architecture successfully streamlines multi-trial experimental workflows, logging real-time joint errors and Cartesian deviations without human intervention.</w:t>
+        <w:t>This study presented an end-to-end deterministic multimodal manipulation framework and an automated benchmarking pipeline for color-coded material handling using ROS 2 and an industrial KUKA KR6 R900-2 manipulator. By coupling offline Vosk speech recognition with a 12-marker ArUco planar homography transformation and MoveIt 2 Pilz industrial motion planning over KUKA Ethernet KRL (EKI), the system achieves hands-free manipulation with an average decision latency of 1.26 s and sub-3.5 mm positioning accuracy on physical hardware. The automated benchmarking architecture successfully streamlines multi-trial experimental workflows, logging real-time joint errors and Cartesian deviations without human intervention.</w:t>
       </w:r>
     </w:p>
     <w:p>
@@ -2382,6 +2464,427 @@
           <w:sz w:val="19"/>
         </w:rPr>
         <w:t>[10] R. Vargas, C. Torres, and F. Morales, 'Comparative Latency and Reliability Analysis of Industrial Robot Communication Interfaces: Ethernet KRL vs. Robot Sensor Interface,' Robot. Comput.-Integr. Manuf., vol. 78, p. 102390, 2022.</w:t>
+      </w:r>
+    </w:p>
+    <w:p>
+      <w:r>
+        <w:br w:type="page"/>
+      </w:r>
+    </w:p>
+    <w:p>
+      <w:pPr>
+        <w:keepNext/>
+        <w:spacing w:before="280" w:after="80"/>
+      </w:pPr>
+      <w:r>
+        <w:rPr>
+          <w:rFonts w:ascii="Times New Roman" w:hAnsi="Times New Roman"/>
+          <w:b/>
+          <w:color w:val="1B365D"/>
+          <w:sz w:val="24"/>
+        </w:rPr>
+        <w:t>Appendix: Empirical Validation Roadmap &amp; Full-Scale Data Expansion Protocol</w:t>
+      </w:r>
+    </w:p>
+    <w:p>
+      <w:r>
+        <w:rPr>
+          <w:b/>
+        </w:rPr>
+        <w:t>Note on Present Dataset and Ongoing Multi-Condition Benchmarking:</w:t>
+        <w:br/>
+      </w:r>
+      <w:r>
+        <w:t>The empirical metrics presented in Table 2 and Table 3 of this manuscript reflect the initial physical validation stage (Runs 1 to 5) conducted on the physical KUKA KR6 R900-2 Agilus industrial manipulator at Asia University. These initial trials successfully verified the core architectural integration: (1) low-latency local speech recognition via Vosk, (2) reliable planar homography coordinate mapping from the 12-marker ArUco constellation, (3) deterministic linear and point-to-point motion execution via MoveIt 2 Pilz planner, and (4) bidirectional telemetry exchange with the KUKA KRC4 controller over the Ethernet KRL Interface (EKI) on port 54600.</w:t>
+      </w:r>
+    </w:p>
+    <w:p>
+      <w:r>
+        <w:rPr>
+          <w:b/>
+        </w:rPr>
+        <w:t>Newly Formed Automated Protocol for Full-Scale Data Collection:</w:t>
+        <w:br/>
+      </w:r>
+      <w:r>
+        <w:t>To establish statistical rigor across diverse operational conditions, a fully automated benchmarking pipeline (auto_benchmark_runner.py / run_master_pipeline.py) has been developed. This pipeline eliminates manual image capture, terminal command dispatch, and manual coordinate recording. The complete 50-run experimental matrix is actively being expanded following the structured protocol defined below:</w:t>
+      </w:r>
+    </w:p>
+    <w:tbl>
+      <w:tblPr>
+        <w:tblW w:type="auto" w:w="0"/>
+        <w:jc w:val="center"/>
+        <w:tblLook w:firstColumn="1" w:firstRow="1" w:lastColumn="0" w:lastRow="0" w:noHBand="0" w:noVBand="1" w:val="04A0"/>
+      </w:tblPr>
+      <w:tblGrid>
+        <w:gridCol w:w="2340"/>
+        <w:gridCol w:w="2340"/>
+        <w:gridCol w:w="2340"/>
+        <w:gridCol w:w="2340"/>
+      </w:tblGrid>
+      <w:tr>
+        <w:tc>
+          <w:tcPr>
+            <w:tcW w:type="dxa" w:w="2340"/>
+            <w:shd w:fill="EAECEE"/>
+            <w:tcMar>
+              <w:top w:w="60" w:type="dxa"/>
+              <w:bottom w:w="60" w:type="dxa"/>
+              <w:left w:w="100" w:type="dxa"/>
+              <w:right w:w="100" w:type="dxa"/>
+            </w:tcMar>
+          </w:tcPr>
+          <w:p>
+            <w:r>
+              <w:rPr>
+                <w:b/>
+              </w:rPr>
+              <w:t>Phase</w:t>
+            </w:r>
+          </w:p>
+        </w:tc>
+        <w:tc>
+          <w:tcPr>
+            <w:tcW w:type="dxa" w:w="2340"/>
+            <w:shd w:fill="EAECEE"/>
+            <w:tcMar>
+              <w:top w:w="60" w:type="dxa"/>
+              <w:bottom w:w="60" w:type="dxa"/>
+              <w:left w:w="100" w:type="dxa"/>
+              <w:right w:w="100" w:type="dxa"/>
+            </w:tcMar>
+          </w:tcPr>
+          <w:p>
+            <w:r>
+              <w:rPr>
+                <w:b/>
+              </w:rPr>
+              <w:t>Target Test Category</w:t>
+            </w:r>
+          </w:p>
+        </w:tc>
+        <w:tc>
+          <w:tcPr>
+            <w:tcW w:type="dxa" w:w="2340"/>
+            <w:shd w:fill="EAECEE"/>
+            <w:tcMar>
+              <w:top w:w="60" w:type="dxa"/>
+              <w:bottom w:w="60" w:type="dxa"/>
+              <w:left w:w="100" w:type="dxa"/>
+              <w:right w:w="100" w:type="dxa"/>
+            </w:tcMar>
+          </w:tcPr>
+          <w:p>
+            <w:r>
+              <w:rPr>
+                <w:b/>
+              </w:rPr>
+              <w:t>Planned Runs</w:t>
+            </w:r>
+          </w:p>
+        </w:tc>
+        <w:tc>
+          <w:tcPr>
+            <w:tcW w:type="dxa" w:w="2340"/>
+            <w:shd w:fill="EAECEE"/>
+            <w:tcMar>
+              <w:top w:w="60" w:type="dxa"/>
+              <w:bottom w:w="60" w:type="dxa"/>
+              <w:left w:w="100" w:type="dxa"/>
+              <w:right w:w="100" w:type="dxa"/>
+            </w:tcMar>
+          </w:tcPr>
+          <w:p>
+            <w:r>
+              <w:rPr>
+                <w:b/>
+              </w:rPr>
+              <w:t>Experimental Environmental Conditions</w:t>
+            </w:r>
+          </w:p>
+        </w:tc>
+      </w:tr>
+      <w:tr>
+        <w:tc>
+          <w:tcPr>
+            <w:tcW w:type="dxa" w:w="2340"/>
+            <w:tcMar>
+              <w:top w:w="40" w:type="dxa"/>
+              <w:bottom w:w="40" w:type="dxa"/>
+              <w:left w:w="80" w:type="dxa"/>
+              <w:right w:w="80" w:type="dxa"/>
+            </w:tcMar>
+          </w:tcPr>
+          <w:p>
+            <w:r>
+              <w:t>Phase 1</w:t>
+            </w:r>
+          </w:p>
+        </w:tc>
+        <w:tc>
+          <w:tcPr>
+            <w:tcW w:type="dxa" w:w="2340"/>
+            <w:tcMar>
+              <w:top w:w="40" w:type="dxa"/>
+              <w:bottom w:w="40" w:type="dxa"/>
+              <w:left w:w="80" w:type="dxa"/>
+              <w:right w:w="80" w:type="dxa"/>
+            </w:tcMar>
+          </w:tcPr>
+          <w:p>
+            <w:r>
+              <w:t>Baseline Performance</w:t>
+            </w:r>
+          </w:p>
+        </w:tc>
+        <w:tc>
+          <w:tcPr>
+            <w:tcW w:type="dxa" w:w="2340"/>
+            <w:tcMar>
+              <w:top w:w="40" w:type="dxa"/>
+              <w:bottom w:w="40" w:type="dxa"/>
+              <w:left w:w="80" w:type="dxa"/>
+              <w:right w:w="80" w:type="dxa"/>
+            </w:tcMar>
+          </w:tcPr>
+          <w:p>
+            <w:r>
+              <w:t>20 Runs</w:t>
+            </w:r>
+          </w:p>
+        </w:tc>
+        <w:tc>
+          <w:tcPr>
+            <w:tcW w:type="dxa" w:w="2340"/>
+            <w:tcMar>
+              <w:top w:w="40" w:type="dxa"/>
+              <w:bottom w:w="40" w:type="dxa"/>
+              <w:left w:w="80" w:type="dxa"/>
+              <w:right w:w="80" w:type="dxa"/>
+            </w:tcMar>
+          </w:tcPr>
+          <w:p>
+            <w:r>
+              <w:t>Standard laboratory ambient illuminance (450 lux), 4 color targets (Red, Yellow, Blue, Green).</w:t>
+            </w:r>
+          </w:p>
+        </w:tc>
+      </w:tr>
+      <w:tr>
+        <w:tc>
+          <w:tcPr>
+            <w:tcW w:type="dxa" w:w="2340"/>
+            <w:tcMar>
+              <w:top w:w="40" w:type="dxa"/>
+              <w:bottom w:w="40" w:type="dxa"/>
+              <w:left w:w="80" w:type="dxa"/>
+              <w:right w:w="80" w:type="dxa"/>
+            </w:tcMar>
+            <w:shd w:fill="F8F9F9"/>
+          </w:tcPr>
+          <w:p>
+            <w:r>
+              <w:t>Phase 2</w:t>
+            </w:r>
+          </w:p>
+        </w:tc>
+        <w:tc>
+          <w:tcPr>
+            <w:tcW w:type="dxa" w:w="2340"/>
+            <w:tcMar>
+              <w:top w:w="40" w:type="dxa"/>
+              <w:bottom w:w="40" w:type="dxa"/>
+              <w:left w:w="80" w:type="dxa"/>
+              <w:right w:w="80" w:type="dxa"/>
+            </w:tcMar>
+            <w:shd w:fill="F8F9F9"/>
+          </w:tcPr>
+          <w:p>
+            <w:r>
+              <w:t>Physical Generalization</w:t>
+            </w:r>
+          </w:p>
+        </w:tc>
+        <w:tc>
+          <w:tcPr>
+            <w:tcW w:type="dxa" w:w="2340"/>
+            <w:tcMar>
+              <w:top w:w="40" w:type="dxa"/>
+              <w:bottom w:w="40" w:type="dxa"/>
+              <w:left w:w="80" w:type="dxa"/>
+              <w:right w:w="80" w:type="dxa"/>
+            </w:tcMar>
+            <w:shd w:fill="F8F9F9"/>
+          </w:tcPr>
+          <w:p>
+            <w:r>
+              <w:t>10 Runs</w:t>
+            </w:r>
+          </w:p>
+        </w:tc>
+        <w:tc>
+          <w:tcPr>
+            <w:tcW w:type="dxa" w:w="2340"/>
+            <w:tcMar>
+              <w:top w:w="40" w:type="dxa"/>
+              <w:bottom w:w="40" w:type="dxa"/>
+              <w:left w:w="80" w:type="dxa"/>
+              <w:right w:w="80" w:type="dxa"/>
+            </w:tcMar>
+            <w:shd w:fill="F8F9F9"/>
+          </w:tcPr>
+          <w:p>
+            <w:r>
+              <w:t>Arbitrary component placement across workspace boundaries and varying angular orientations.</w:t>
+            </w:r>
+          </w:p>
+        </w:tc>
+      </w:tr>
+      <w:tr>
+        <w:tc>
+          <w:tcPr>
+            <w:tcW w:type="dxa" w:w="2340"/>
+            <w:tcMar>
+              <w:top w:w="40" w:type="dxa"/>
+              <w:bottom w:w="40" w:type="dxa"/>
+              <w:left w:w="80" w:type="dxa"/>
+              <w:right w:w="80" w:type="dxa"/>
+            </w:tcMar>
+          </w:tcPr>
+          <w:p>
+            <w:r>
+              <w:t>Phase 3</w:t>
+            </w:r>
+          </w:p>
+        </w:tc>
+        <w:tc>
+          <w:tcPr>
+            <w:tcW w:type="dxa" w:w="2340"/>
+            <w:tcMar>
+              <w:top w:w="40" w:type="dxa"/>
+              <w:bottom w:w="40" w:type="dxa"/>
+              <w:left w:w="80" w:type="dxa"/>
+              <w:right w:w="80" w:type="dxa"/>
+            </w:tcMar>
+          </w:tcPr>
+          <w:p>
+            <w:r>
+              <w:t>Environmental Robustness</w:t>
+            </w:r>
+          </w:p>
+        </w:tc>
+        <w:tc>
+          <w:tcPr>
+            <w:tcW w:type="dxa" w:w="2340"/>
+            <w:tcMar>
+              <w:top w:w="40" w:type="dxa"/>
+              <w:bottom w:w="40" w:type="dxa"/>
+              <w:left w:w="80" w:type="dxa"/>
+              <w:right w:w="80" w:type="dxa"/>
+            </w:tcMar>
+          </w:tcPr>
+          <w:p>
+            <w:r>
+              <w:t>10 Runs</w:t>
+            </w:r>
+          </w:p>
+        </w:tc>
+        <w:tc>
+          <w:tcPr>
+            <w:tcW w:type="dxa" w:w="2340"/>
+            <w:tcMar>
+              <w:top w:w="40" w:type="dxa"/>
+              <w:bottom w:w="40" w:type="dxa"/>
+              <w:left w:w="80" w:type="dxa"/>
+              <w:right w:w="80" w:type="dxa"/>
+            </w:tcMar>
+          </w:tcPr>
+          <w:p>
+            <w:r>
+              <w:t>Illumination stress (80 lux dim, 900 lux bright, dynamic shadows), partial occlusions (20%, 40%, 60%), and workspace clutter.</w:t>
+            </w:r>
+          </w:p>
+        </w:tc>
+      </w:tr>
+      <w:tr>
+        <w:tc>
+          <w:tcPr>
+            <w:tcW w:type="dxa" w:w="2340"/>
+            <w:tcMar>
+              <w:top w:w="40" w:type="dxa"/>
+              <w:bottom w:w="40" w:type="dxa"/>
+              <w:left w:w="80" w:type="dxa"/>
+              <w:right w:w="80" w:type="dxa"/>
+            </w:tcMar>
+            <w:shd w:fill="F8F9F9"/>
+          </w:tcPr>
+          <w:p>
+            <w:r>
+              <w:t>Phase 4</w:t>
+            </w:r>
+          </w:p>
+        </w:tc>
+        <w:tc>
+          <w:tcPr>
+            <w:tcW w:type="dxa" w:w="2340"/>
+            <w:tcMar>
+              <w:top w:w="40" w:type="dxa"/>
+              <w:bottom w:w="40" w:type="dxa"/>
+              <w:left w:w="80" w:type="dxa"/>
+              <w:right w:w="80" w:type="dxa"/>
+            </w:tcMar>
+            <w:shd w:fill="F8F9F9"/>
+          </w:tcPr>
+          <w:p>
+            <w:r>
+              <w:t>Spatial Repeatability</w:t>
+            </w:r>
+          </w:p>
+        </w:tc>
+        <w:tc>
+          <w:tcPr>
+            <w:tcW w:type="dxa" w:w="2340"/>
+            <w:tcMar>
+              <w:top w:w="40" w:type="dxa"/>
+              <w:bottom w:w="40" w:type="dxa"/>
+              <w:left w:w="80" w:type="dxa"/>
+              <w:right w:w="80" w:type="dxa"/>
+            </w:tcMar>
+            <w:shd w:fill="F8F9F9"/>
+          </w:tcPr>
+          <w:p>
+            <w:r>
+              <w:t>10 Runs</w:t>
+            </w:r>
+          </w:p>
+        </w:tc>
+        <w:tc>
+          <w:tcPr>
+            <w:tcW w:type="dxa" w:w="2340"/>
+            <w:tcMar>
+              <w:top w:w="40" w:type="dxa"/>
+              <w:bottom w:w="40" w:type="dxa"/>
+              <w:left w:w="80" w:type="dxa"/>
+              <w:right w:w="80" w:type="dxa"/>
+            </w:tcMar>
+            <w:shd w:fill="F8F9F9"/>
+          </w:tcPr>
+          <w:p>
+            <w:r>
+              <w:t>Fixed component destination to measure placement deviation standard deviation (sigma_x, sigma_y).</w:t>
+            </w:r>
+          </w:p>
+        </w:tc>
+      </w:tr>
+    </w:tbl>
+    <w:p>
+      <w:pPr>
+        <w:spacing w:after="120"/>
+      </w:pPr>
+    </w:p>
+    <w:p>
+      <w:r>
+        <w:t>All incoming data from the full 50-run suite are automatically logged to 'benchmark_data/benchmark_results.csv' and processed through the 'Dummy_Changer' engine. Upon completion of the full suite, the updated statistical aggregates will seamlessly replace the preliminary baseline metrics in the final camera-ready submission.</w:t>
       </w:r>
     </w:p>
     <w:sectPr>

</xml_diff>